<commit_message>
Düzeltme: kaynaklar dağıtık olduğu için sahte KAYNAKLAR bloğu kaldırıldı
Kaynaklar her alt bölümün sonunda yazarın koyduğu yerde bırakıldı; metin
içeriği birebir korundu (sadece biçim: TNR/punto/hiza/başlık + yazar adı
büyük-küçük harf düzeltmesi).

Co-Authored-By: Claude Opus 4.8 (1M context) <noreply@anthropic.com>
</commit_message>
<xml_diff>
--- a/Bolum1_Asendan_Aort_Cerrahisi_Anestezi_Yonetimi.docx
+++ b/Bolum1_Asendan_Aort_Cerrahisi_Anestezi_Yonetimi.docx
@@ -8179,47 +8179,32 @@
     </w:p>
     <w:p>
       <w:pPr>
-        <w:spacing w:before="240" w:after="120" w:lineRule="auto" w:line="360"/>
-        <w:ind w:firstLine="0" w:left="0"/>
-        <w:jc w:val="left"/>
-      </w:pPr>
-      <w:r>
-        <w:rPr>
-          <w:rFonts w:ascii="Times New Roman" w:hAnsi="Times New Roman" w:cs="Times New Roman"/>
-          <w:b/>
-          <w:sz w:val="28"/>
-        </w:rPr>
-        <w:t>KAYNAKLAR</w:t>
-      </w:r>
-    </w:p>
-    <w:p>
-      <w:pPr>
-        <w:spacing w:before="0" w:after="80" w:lineRule="auto" w:line="360"/>
-        <w:ind w:left="425" w:hanging="425"/>
-        <w:jc w:val="left"/>
-      </w:pPr>
-      <w:r>
-        <w:rPr>
-          <w:rFonts w:ascii="Times New Roman" w:hAnsi="Times New Roman" w:cs="Times New Roman"/>
-          <w:b w:val="0"/>
-          <w:sz w:val="22"/>
-        </w:rPr>
-        <w:t>1. Kaplan, J. A., Augoustides, J. G., Manecke, G. R., &amp; Maus, T. (Eds.). (2024). Kaplan's Cardiac Anesthesia: In Cardiac and Noncardiac Surgery (8th ed.). Elsevier. (Bölüm: Postoperative Care of the Cardiac Surgical Patient &amp; Cardiac Pacing and Electrotherapy).</w:t>
-      </w:r>
-    </w:p>
-    <w:p>
-      <w:pPr>
-        <w:spacing w:before="0" w:after="80" w:lineRule="auto" w:line="360"/>
-        <w:ind w:left="425" w:hanging="425"/>
-        <w:jc w:val="left"/>
-      </w:pPr>
-      <w:r>
-        <w:rPr>
-          <w:rFonts w:ascii="Times New Roman" w:hAnsi="Times New Roman" w:cs="Times New Roman"/>
-          <w:b w:val="0"/>
-          <w:sz w:val="22"/>
-        </w:rPr>
-        <w:t>2. Glikson, M., Nielsen, J. C., Kronborg, M. B., et al. (2021). 2021 ESC Guidelines on cardiac pacing and cardiac resynchronization therapy. European Heart Journal, 42(35), 3427-3520.</w:t>
+        <w:spacing w:before="0" w:after="0" w:lineRule="auto" w:line="360"/>
+        <w:ind w:firstLine="0" w:left="0"/>
+        <w:jc w:val="both"/>
+      </w:pPr>
+      <w:r>
+        <w:rPr>
+          <w:rFonts w:ascii="Times New Roman" w:hAnsi="Times New Roman" w:cs="Times New Roman"/>
+          <w:b w:val="0"/>
+          <w:sz w:val="22"/>
+        </w:rPr>
+        <w:t>Kaplan, J. A., Augoustides, J. G., Manecke, G. R., &amp; Maus, T. (Eds.). (2024). Kaplan's Cardiac Anesthesia: In Cardiac and Noncardiac Surgery (8th ed.). Elsevier. (Bölüm: Postoperative Care of the Cardiac Surgical Patient &amp; Cardiac Pacing and Electrotherapy).</w:t>
+      </w:r>
+    </w:p>
+    <w:p>
+      <w:pPr>
+        <w:spacing w:before="0" w:after="0" w:lineRule="auto" w:line="360"/>
+        <w:ind w:firstLine="0" w:left="0"/>
+        <w:jc w:val="both"/>
+      </w:pPr>
+      <w:r>
+        <w:rPr>
+          <w:rFonts w:ascii="Times New Roman" w:hAnsi="Times New Roman" w:cs="Times New Roman"/>
+          <w:b w:val="0"/>
+          <w:sz w:val="22"/>
+        </w:rPr>
+        <w:t>Glikson, M., Nielsen, J. C., Kronborg, M. B., et al. (2021). 2021 ESC Guidelines on cardiac pacing and cardiac resynchronization therapy. European Heart Journal, 42(35), 3427-3520.</w:t>
       </w:r>
     </w:p>
     <w:sectPr>

</xml_diff>